<commit_message>
Added Renv and helper scripts
</commit_message>
<xml_diff>
--- a/Microbiome_Brain_Tumors/output/tables/WGS/Brain_Mets_by_overall_progression_SSO_WGS_Saliva.docx
+++ b/Microbiome_Brain_Tumors/output/tables/WGS/Brain_Mets_by_overall_progression_SSO_WGS_Saliva.docx
@@ -1896,7 +1896,7 @@
                 <w:rFonts w:ascii="Calibri" w:hAnsi="Calibri"/>
                 <w:sz w:val="20"/>
               </w:rPr>
-              <w:t xml:space="default">0.5</w:t>
+              <w:t xml:space="default">0.6</w:t>
             </w:r>
             <w:r>
               <w:rPr>
@@ -2309,7 +2309,7 @@
                 <w:rFonts w:ascii="Calibri" w:hAnsi="Calibri"/>
                 <w:sz w:val="20"/>
               </w:rPr>
-              <w:t xml:space="default">0.025</w:t>
+              <w:t xml:space="default">0.019</w:t>
             </w:r>
             <w:r>
               <w:rPr>

</xml_diff>